<commit_message>
docs: add current manuscript drafts (thesis_25, decisions_log_8)
</commit_message>
<xml_diff>
--- a/manuscript/decisions_log_8.docx
+++ b/manuscript/decisions_log_8.docx
@@ -980,7 +980,6 @@
         </w:pBdr>
       </w:pPr>
       <w:r>
-        <w:lastRenderedPageBreak/>
         <w:t>WP1 — Baseline Stratejiler</w:t>
       </w:r>
     </w:p>
@@ -2343,6 +2342,7 @@
                 <w:sz w:val="20"/>
                 <w:szCs w:val="20"/>
               </w:rPr>
+              <w:lastRenderedPageBreak/>
               <w:t>İkilem</w:t>
             </w:r>
           </w:p>
@@ -2404,7 +2404,6 @@
                 <w:sz w:val="20"/>
                 <w:szCs w:val="20"/>
               </w:rPr>
-              <w:lastRenderedPageBreak/>
               <w:t>Seçenekler</w:t>
             </w:r>
           </w:p>
@@ -3850,7 +3849,6 @@
         </w:pBdr>
       </w:pPr>
       <w:r>
-        <w:lastRenderedPageBreak/>
         <w:t>WP3 — Gymnasium Environment</w:t>
       </w:r>
     </w:p>
@@ -5446,6 +5444,7 @@
                 <w:sz w:val="20"/>
                 <w:szCs w:val="20"/>
               </w:rPr>
+              <w:lastRenderedPageBreak/>
               <w:t>Etki</w:t>
             </w:r>
           </w:p>
@@ -5493,7 +5492,6 @@
         </w:pBdr>
       </w:pPr>
       <w:r>
-        <w:lastRenderedPageBreak/>
         <w:t>WP4 / WP5 — Geçiş Kararları</w:t>
       </w:r>
     </w:p>
@@ -7028,6 +7026,7 @@
                 <w:sz w:val="20"/>
                 <w:szCs w:val="20"/>
               </w:rPr>
+              <w:lastRenderedPageBreak/>
               <w:t>Neden</w:t>
             </w:r>
           </w:p>
@@ -8648,6 +8647,7 @@
                 <w:sz w:val="20"/>
                 <w:szCs w:val="20"/>
               </w:rPr>
+              <w:lastRenderedPageBreak/>
               <w:t>Neden</w:t>
             </w:r>
           </w:p>
@@ -8800,7 +8800,6 @@
                 <w:sz w:val="20"/>
                 <w:szCs w:val="20"/>
               </w:rPr>
-              <w:lastRenderedPageBreak/>
               <w:t>WP5</w:t>
             </w:r>
           </w:p>
@@ -9875,6 +9874,7 @@
                 <w:sz w:val="20"/>
                 <w:szCs w:val="20"/>
               </w:rPr>
+              <w:lastRenderedPageBreak/>
               <w:t>Neden</w:t>
             </w:r>
           </w:p>
@@ -15563,7 +15563,15 @@
                 <w:color w:val="2C2C2C"/>
                 <w:sz w:val="20"/>
               </w:rPr>
-              <w:t>B — Her iki bölümde p ve 95% CI recompute değerlerine güncellendi; ek olarak 90% CI (TOST α=0.05'e karşılık gelen aralık) eklendi. Normal: 90% CI [−0.001, +0.063] ±0.10 içinde. Misspec: 90% CI [−0.040, +0.048] ±0.05 içinde.</w:t>
+              <w:t xml:space="preserve">B — Her iki bölümde p ve 95% CI recompute değerlerine güncellendi; ek olarak 90% CI (TOST α=0.05'e karşılık gelen aralık) eklendi. Normal: 90% </w:t>
+            </w:r>
+            <w:r>
+              <w:rPr>
+                <w:color w:val="2C2C2C"/>
+                <w:sz w:val="20"/>
+              </w:rPr>
+              <w:lastRenderedPageBreak/>
+              <w:t>CI [−0.001, +0.063] ±0.10 içinde. Misspec: 90% CI [−0.040, +0.048] ±0.05 içinde.</w:t>
             </w:r>
           </w:p>
         </w:tc>
@@ -15593,6 +15601,7 @@
                 <w:color w:val="1F4E79"/>
                 <w:sz w:val="20"/>
               </w:rPr>
+              <w:lastRenderedPageBreak/>
               <w:t>Neden</w:t>
             </w:r>
           </w:p>
@@ -16236,7 +16245,6 @@
                 <w:sz w:val="20"/>
                 <w:szCs w:val="20"/>
               </w:rPr>
-              <w:lastRenderedPageBreak/>
               <w:t>5</w:t>
             </w:r>
           </w:p>

</xml_diff>